<commit_message>
Reader Report forms: July 2025 footers; PDFs print Word-pasted text cleanly
- CSHSE's "July 2025" reader-report files still had stale footers (associate
  "July 2022", baccalaureate "Associate's Degree … July 2023", masters "July
  2020"), so Lauri's download read as "the 22 reader report". Footers now say
  July 2025 with the right level (scripts/fix_template_footers.py).
- Built-in PDF fonts only encode WinAnsi, so Symbol-font bullets, tabs and
  other pasted glyphs printed as garbage in her Lead Reader Report PDF
  ("•"–æ6ÇVFRPvidence…"). All Reader/Lead PDF text now goes through pdfSafe.

Co-Authored-By: Claude Opus 5.5 <noreply@anthropic.com>
</commit_message>
<xml_diff>
--- a/CSHSE/server/src/assets/reader-report-templates/baccalaureate.docx
+++ b/CSHSE/server/src/assets/reader-report-templates/baccalaureate.docx
@@ -22267,7 +22267,7 @@
                 <w:sz w:val="16"/>
                 <w:szCs w:val="16"/>
               </w:rPr>
-              <w:t>Associate’s Degree</w:t>
+              <w:t>Baccalaureate Degree</w:t>
             </w:r>
             <w:proofErr w:type="gramEnd"/>
             <w:r>
@@ -22316,7 +22316,7 @@
                 <w:sz w:val="16"/>
                 <w:szCs w:val="16"/>
               </w:rPr>
-              <w:t>3</w:t>
+              <w:t>5</w:t>
             </w:r>
             <w:r>
               <w:rPr>

</xml_diff>

<commit_message>
Reader Report: bacc Program Information rows follow the certification check
They took the Introduction's overall mark, so one non-compliant intro item
marked 'Person responsible signed off' etc. Non-Compliant.

Co-Authored-By: Claude Opus 5.5 <noreply@anthropic.com>
</commit_message>
<xml_diff>
--- a/CSHSE/server/src/assets/reader-report-templates/baccalaureate.docx
+++ b/CSHSE/server/src/assets/reader-report-templates/baccalaureate.docx
@@ -744,7 +744,7 @@
               <w:rPr>
                 <w:sz w:val="22"/>
               </w:rPr>
-              <w:t>{{c_introduction_a}}</w:t>
+              <w:t>{{c_intro_a_p4}}</w:t>
             </w:r>
           </w:p>
         </w:tc>
@@ -763,7 +763,7 @@
               <w:rPr>
                 <w:sz w:val="22"/>
               </w:rPr>
-              <w:t>{{n_introduction_a}}</w:t>
+              <w:t>{{n_intro_a_p4}}</w:t>
             </w:r>
           </w:p>
         </w:tc>
@@ -778,12 +778,6 @@
                 <w:rFonts w:ascii="Times New Roman" w:eastAsia="Times New Roman" w:hAnsi="Times New Roman" w:cs="Times New Roman"/>
               </w:rPr>
             </w:pPr>
-            <w:r>
-              <w:rPr>
-                <w:sz w:val="16"/>
-              </w:rPr>
-              <w:t>{{cm_introduction_a}}</w:t>
-            </w:r>
           </w:p>
         </w:tc>
       </w:tr>
@@ -830,7 +824,7 @@
               <w:rPr>
                 <w:sz w:val="22"/>
               </w:rPr>
-              <w:t>{{c_intro_a_p4}}</w:t>
+              <w:t>{{c_intro_a_p5}}</w:t>
             </w:r>
           </w:p>
         </w:tc>
@@ -849,7 +843,7 @@
               <w:rPr>
                 <w:sz w:val="22"/>
               </w:rPr>
-              <w:t>{{n_intro_a_p4}}</w:t>
+              <w:t>{{n_intro_a_p5}}</w:t>
             </w:r>
           </w:p>
         </w:tc>
@@ -905,7 +899,7 @@
               <w:rPr>
                 <w:sz w:val="22"/>
               </w:rPr>
-              <w:t>{{c_intro_a_p5}}</w:t>
+              <w:t>{{c_intro_a_p6}}</w:t>
             </w:r>
           </w:p>
         </w:tc>
@@ -924,7 +918,7 @@
               <w:rPr>
                 <w:sz w:val="22"/>
               </w:rPr>
-              <w:t>{{n_intro_a_p5}}</w:t>
+              <w:t>{{n_intro_a_p6}}</w:t>
             </w:r>
           </w:p>
         </w:tc>
@@ -1156,6 +1150,12 @@
                 <w:rFonts w:ascii="Times New Roman" w:eastAsia="Times New Roman" w:hAnsi="Times New Roman" w:cs="Times New Roman"/>
               </w:rPr>
             </w:pPr>
+            <w:r>
+              <w:rPr>
+                <w:sz w:val="16"/>
+              </w:rPr>
+              <w:t>{{cm_introduction_a}}</w:t>
+            </w:r>
           </w:p>
         </w:tc>
       </w:tr>

</xml_diff>